<commit_message>
Dimensionamento da fonte: analise de corrente e fonte 5 V / 5 A
Novo cad/verificacao_eletrica.py: modelo de motor CC alimentado pelas
fracoes de torque de verificacao.py.

- datasheet TowerPro do MG90S nao publica corrente nenhuma; valores de
  medicao de terceiros a 5 V (10 mA / 120-250 mA / 700 mA travado)
- pior caso de operacao 1,85 A; falha com os 4 travados 2,70 A;
  pico de inversao de sentido ~2,6 A no barramento
- fonte passa de 3 A para 5 A (3 A funciona, mas a 90 % do nominal
  na falha); nao subir para 6 V
- C1 cobre 2 A por 100 us: capacitor nao substitui corrente de fonte;
  +4 ceramicos de 100 nF na BOM
- orcamento de queda de 200 mV: 20 AWG no trecho fonte->protoboard e
  entrada da trilha por dois furos

Relatorio ganha secao 8.1; esquema, guia HTML (PNG reembutido),
cabecalho do firmware e BOM atualizados.

Co-Authored-By: Claude Opus 5 <noreply@anthropic.com>
</commit_message>
<xml_diff>
--- a/relatorio/Relatorio_Braco_Robotico.docx
+++ b/relatorio/Relatorio_Braco_Robotico.docx
@@ -849,7 +849,7 @@
               <w:rPr>
                 <w:sz w:val="18"/>
               </w:rPr>
-              <w:t>Fonte 5 V / 3 A para os servos; Arduino pelo USB OU pela mesma fonte (nunca os dois ao mesmo tempo); GND comum</w:t>
+              <w:t>Fonte chaveada 5 V / 5 A para os servos (mínimo aceitável 3 A — ver seção 8.1); Arduino pelo USB OU pela mesma fonte (nunca os dois ao mesmo tempo); GND comum</w:t>
             </w:r>
           </w:p>
         </w:tc>
@@ -2031,7 +2031,7 @@
               <w:rPr>
                 <w:sz w:val="17"/>
               </w:rPr>
-              <w:t>Fonte chaveada 5 V / 3 A com plug P4</w:t>
+              <w:t>Fonte chaveada 5 V / 5 A com plug P4 (2,1 mm, centro positivo)</w:t>
             </w:r>
           </w:p>
         </w:tc>
@@ -2059,7 +2059,7 @@
               <w:rPr>
                 <w:sz w:val="17"/>
               </w:rPr>
-              <w:t>35</w:t>
+              <w:t>50</w:t>
             </w:r>
           </w:p>
         </w:tc>
@@ -2073,7 +2073,7 @@
               <w:rPr>
                 <w:sz w:val="17"/>
               </w:rPr>
-              <w:t>35</w:t>
+              <w:t>50</w:t>
             </w:r>
           </w:p>
         </w:tc>
@@ -2087,7 +2087,7 @@
               <w:rPr>
                 <w:sz w:val="17"/>
               </w:rPr>
-              <w:t>Alimentação dos servos</w:t>
+              <w:t>Alimentação dos servos. Dimensionamento na seção 8.1: 1,85 A no pior caso de operação e 2,70 A com os 4 servos travados. Uma fonte de 3 A atende a operação normal, mas fica a 90 % do nominal em travamento</w:t>
             </w:r>
           </w:p>
         </w:tc>
@@ -2203,7 +2203,7 @@
               <w:rPr>
                 <w:sz w:val="17"/>
               </w:rPr>
-              <w:t>Capacitor eletrolítico 1000 µF / 16 V</w:t>
+              <w:t>Capacitor eletrolítico 1000 µF / 16 V (+ 4 cerâmicos 100 nF)</w:t>
             </w:r>
           </w:p>
         </w:tc>
@@ -2231,7 +2231,7 @@
               <w:rPr>
                 <w:sz w:val="17"/>
               </w:rPr>
-              <w:t>2</w:t>
+              <w:t>4</w:t>
             </w:r>
           </w:p>
         </w:tc>
@@ -2245,7 +2245,7 @@
               <w:rPr>
                 <w:sz w:val="17"/>
               </w:rPr>
-              <w:t>2</w:t>
+              <w:t>4</w:t>
             </w:r>
           </w:p>
         </w:tc>
@@ -2259,7 +2259,7 @@
               <w:rPr>
                 <w:sz w:val="17"/>
               </w:rPr>
-              <w:t>Desacoplamento do barramento dos servos</w:t>
+              <w:t>Desacoplamento do barramento dos servos: o eletrolítico cobre o degrau de corrente até a fonte reagir (~100 µs); os cerâmicos, junto a cada conector, cortam o ruído de comutação do motor</w:t>
             </w:r>
           </w:p>
         </w:tc>
@@ -2874,7 +2874,7 @@
           <w:b/>
           <w:i w:val="0"/>
         </w:rPr>
-        <w:t>Custo total estimado: R$ 342.</w:t>
+        <w:t>Custo total estimado: R$ 359.</w:t>
       </w:r>
     </w:p>
     <w:p>
@@ -6508,7 +6508,7 @@
               <w:rPr>
                 <w:sz w:val="18"/>
               </w:rPr>
-              <w:t>Fonte 5 V / 3 A + C1 1000 µF</w:t>
+              <w:t>Fonte 5 V / 5 A + C1 1000 µF</w:t>
             </w:r>
           </w:p>
         </w:tc>
@@ -6589,6 +6589,14 @@
     <w:p/>
     <w:p>
       <w:pPr>
+        <w:pStyle w:val="Heading2"/>
+      </w:pPr>
+      <w:r>
+        <w:t>8.1 Dimensionamento da fonte de alimentação</w:t>
+      </w:r>
+    </w:p>
+    <w:p>
+      <w:pPr>
         <w:jc w:val="both"/>
       </w:pPr>
       <w:r>
@@ -6596,15 +6604,19 @@
           <w:b w:val="0"/>
           <w:i w:val="0"/>
         </w:rPr>
-        <w:t>Consumo: cada micro-servo pode drenar picos de 0,6–0,8 A ao partir ou sob carga; quatro servos exigem fonte de ao menos 2,5 A. O capacitor C1 próximo ao barramento reduz quedas de tensão que provocam reset do Arduino e tremores (jitter) nos servos.</w:t>
-      </w:r>
-    </w:p>
-    <w:p>
-      <w:pPr>
-        <w:pStyle w:val="Heading1"/>
-      </w:pPr>
-      <w:r>
-        <w:t>9. Firmware (Arduino IDE)</w:t>
+        <w:t>O datasheet do MG90S (TowerPro) publica apenas massa, dimensões, torque de travamento (1,8 kgf·cm a 4,8 V e 2,2 kgf·cm a 6 V), velocidade (0,1 s/60° a 4,8 V), faixa de tensão (4,8–6,0 V) e banda morta (5 µs) — não há nenhuma especificação de corrente. O dimensionamento foi feito, portanto, a partir de medições publicadas por fornecedores (a 5 V: 10 mA em repouso, 120–250 mA girando em vazio e 700 mA com o rotor travado) combinadas com o modelo de motor CC de escovas, no qual a corrente cresce linearmente com o torque exigido:</w:t>
+      </w:r>
+    </w:p>
+    <w:p>
+      <w:pPr>
+        <w:jc w:val="center"/>
+      </w:pPr>
+      <w:r>
+        <w:rPr>
+          <w:b w:val="0"/>
+          <w:i/>
+        </w:rPr>
+        <w:t>I(T) = I₀ + (I_travado − I₀) · (T / T_travado)</w:t>
       </w:r>
     </w:p>
     <w:p>
@@ -6616,6 +6628,796 @@
           <w:b w:val="0"/>
           <w:i w:val="0"/>
         </w:rPr>
+        <w:t>Aplicando as frações de torque calculadas na seção 5.4 (corpo livre com as massas reais das malhas), chega-se ao consumo por junta e aos cenários de operação abaixo. O script cad/verificacao_eletrica.py reproduz a tabela.</w:t>
+      </w:r>
+    </w:p>
+    <w:tbl>
+      <w:tblPr>
+        <w:tblStyle w:val="LightGrid-Accent1"/>
+        <w:tblW w:type="auto" w:w="0"/>
+        <w:jc w:val="center"/>
+        <w:tblLook w:firstColumn="1" w:firstRow="1" w:lastColumn="0" w:lastRow="0" w:noHBand="0" w:noVBand="1" w:val="04A0"/>
+      </w:tblPr>
+      <w:tblGrid>
+        <w:gridCol w:w="2351"/>
+        <w:gridCol w:w="2351"/>
+        <w:gridCol w:w="2351"/>
+        <w:gridCol w:w="2351"/>
+      </w:tblGrid>
+      <w:tr>
+        <w:tc>
+          <w:tcPr>
+            <w:tcW w:type="dxa" w:w="2551"/>
+          </w:tcPr>
+          <w:p>
+            <w:r/>
+            <w:r>
+              <w:rPr>
+                <w:b/>
+                <w:sz w:val="18"/>
+              </w:rPr>
+              <w:t>Junta (servo)</w:t>
+            </w:r>
+          </w:p>
+        </w:tc>
+        <w:tc>
+          <w:tcPr>
+            <w:tcW w:type="dxa" w:w="3118"/>
+          </w:tcPr>
+          <w:p>
+            <w:r/>
+            <w:r>
+              <w:rPr>
+                <w:b/>
+                <w:sz w:val="18"/>
+              </w:rPr>
+              <w:t>Torque exigido</w:t>
+            </w:r>
+          </w:p>
+        </w:tc>
+        <w:tc>
+          <w:tcPr>
+            <w:tcW w:type="dxa" w:w="1701"/>
+          </w:tcPr>
+          <w:p>
+            <w:r/>
+            <w:r>
+              <w:rPr>
+                <w:b/>
+                <w:sz w:val="18"/>
+              </w:rPr>
+              <w:t>Corrente movendo</w:t>
+            </w:r>
+          </w:p>
+        </w:tc>
+        <w:tc>
+          <w:tcPr>
+            <w:tcW w:type="dxa" w:w="1701"/>
+          </w:tcPr>
+          <w:p>
+            <w:r/>
+            <w:r>
+              <w:rPr>
+                <w:b/>
+                <w:sz w:val="18"/>
+              </w:rPr>
+              <w:t>Com 25 g na garra</w:t>
+            </w:r>
+          </w:p>
+        </w:tc>
+      </w:tr>
+      <w:tr>
+        <w:tc>
+          <w:tcPr>
+            <w:tcW w:type="dxa" w:w="2551"/>
+          </w:tcPr>
+          <w:p>
+            <w:r/>
+            <w:r>
+              <w:rPr>
+                <w:sz w:val="18"/>
+              </w:rPr>
+              <w:t>S1 base (SG90)</w:t>
+            </w:r>
+          </w:p>
+        </w:tc>
+        <w:tc>
+          <w:tcPr>
+            <w:tcW w:type="dxa" w:w="3118"/>
+          </w:tcPr>
+          <w:p>
+            <w:r/>
+            <w:r>
+              <w:rPr>
+                <w:sz w:val="18"/>
+              </w:rPr>
+              <w:t>≈ 5 % do travamento (eixo vertical)</w:t>
+            </w:r>
+          </w:p>
+        </w:tc>
+        <w:tc>
+          <w:tcPr>
+            <w:tcW w:type="dxa" w:w="1701"/>
+          </w:tcPr>
+          <w:p>
+            <w:r/>
+            <w:r>
+              <w:rPr>
+                <w:sz w:val="18"/>
+              </w:rPr>
+              <w:t>272 mA</w:t>
+            </w:r>
+          </w:p>
+        </w:tc>
+        <w:tc>
+          <w:tcPr>
+            <w:tcW w:type="dxa" w:w="1701"/>
+          </w:tcPr>
+          <w:p>
+            <w:r/>
+            <w:r>
+              <w:rPr>
+                <w:sz w:val="18"/>
+              </w:rPr>
+              <w:t>286 mA</w:t>
+            </w:r>
+          </w:p>
+        </w:tc>
+      </w:tr>
+      <w:tr>
+        <w:tc>
+          <w:tcPr>
+            <w:tcW w:type="dxa" w:w="2551"/>
+          </w:tcPr>
+          <w:p>
+            <w:r/>
+            <w:r>
+              <w:rPr>
+                <w:sz w:val="18"/>
+              </w:rPr>
+              <w:t>S2 ombro (MG90S)</w:t>
+            </w:r>
+          </w:p>
+        </w:tc>
+        <w:tc>
+          <w:tcPr>
+            <w:tcW w:type="dxa" w:w="3118"/>
+          </w:tcPr>
+          <w:p>
+            <w:r/>
+            <w:r>
+              <w:rPr>
+                <w:sz w:val="18"/>
+              </w:rPr>
+              <w:t>29 % em vazio / 54 % com 25 g</w:t>
+            </w:r>
+          </w:p>
+        </w:tc>
+        <w:tc>
+          <w:tcPr>
+            <w:tcW w:type="dxa" w:w="1701"/>
+          </w:tcPr>
+          <w:p>
+            <w:r/>
+            <w:r>
+              <w:rPr>
+                <w:sz w:val="18"/>
+              </w:rPr>
+              <w:t>380 mA</w:t>
+            </w:r>
+          </w:p>
+        </w:tc>
+        <w:tc>
+          <w:tcPr>
+            <w:tcW w:type="dxa" w:w="1701"/>
+          </w:tcPr>
+          <w:p>
+            <w:r/>
+            <w:r>
+              <w:rPr>
+                <w:sz w:val="18"/>
+              </w:rPr>
+              <w:t>493 mA</w:t>
+            </w:r>
+          </w:p>
+        </w:tc>
+      </w:tr>
+      <w:tr>
+        <w:tc>
+          <w:tcPr>
+            <w:tcW w:type="dxa" w:w="2551"/>
+          </w:tcPr>
+          <w:p>
+            <w:r/>
+            <w:r>
+              <w:rPr>
+                <w:sz w:val="18"/>
+              </w:rPr>
+              <w:t>S3 cotovelo (MG90S)</w:t>
+            </w:r>
+          </w:p>
+        </w:tc>
+        <w:tc>
+          <w:tcPr>
+            <w:tcW w:type="dxa" w:w="3118"/>
+          </w:tcPr>
+          <w:p>
+            <w:r/>
+            <w:r>
+              <w:rPr>
+                <w:sz w:val="18"/>
+              </w:rPr>
+              <w:t>18 % em vazio / 28 % com 25 g</w:t>
+            </w:r>
+          </w:p>
+        </w:tc>
+        <w:tc>
+          <w:tcPr>
+            <w:tcW w:type="dxa" w:w="1701"/>
+          </w:tcPr>
+          <w:p>
+            <w:r/>
+            <w:r>
+              <w:rPr>
+                <w:sz w:val="18"/>
+              </w:rPr>
+              <w:t>331 mA</w:t>
+            </w:r>
+          </w:p>
+        </w:tc>
+        <w:tc>
+          <w:tcPr>
+            <w:tcW w:type="dxa" w:w="1701"/>
+          </w:tcPr>
+          <w:p>
+            <w:r/>
+            <w:r>
+              <w:rPr>
+                <w:sz w:val="18"/>
+              </w:rPr>
+              <w:t>376 mA</w:t>
+            </w:r>
+          </w:p>
+        </w:tc>
+      </w:tr>
+      <w:tr>
+        <w:tc>
+          <w:tcPr>
+            <w:tcW w:type="dxa" w:w="2551"/>
+          </w:tcPr>
+          <w:p>
+            <w:r/>
+            <w:r>
+              <w:rPr>
+                <w:sz w:val="18"/>
+              </w:rPr>
+              <w:t>S4 garra (SG90)</w:t>
+            </w:r>
+          </w:p>
+        </w:tc>
+        <w:tc>
+          <w:tcPr>
+            <w:tcW w:type="dxa" w:w="3118"/>
+          </w:tcPr>
+          <w:p>
+            <w:r/>
+            <w:r>
+              <w:rPr>
+                <w:sz w:val="18"/>
+              </w:rPr>
+              <w:t>travamento parcial ao apertar o objeto</w:t>
+            </w:r>
+          </w:p>
+        </w:tc>
+        <w:tc>
+          <w:tcPr>
+            <w:tcW w:type="dxa" w:w="1701"/>
+          </w:tcPr>
+          <w:p>
+            <w:r/>
+            <w:r>
+              <w:rPr>
+                <w:sz w:val="18"/>
+              </w:rPr>
+              <w:t>295 mA</w:t>
+            </w:r>
+          </w:p>
+        </w:tc>
+        <w:tc>
+          <w:tcPr>
+            <w:tcW w:type="dxa" w:w="1701"/>
+          </w:tcPr>
+          <w:p>
+            <w:r/>
+            <w:r>
+              <w:rPr>
+                <w:sz w:val="18"/>
+              </w:rPr>
+              <w:t>520 mA</w:t>
+            </w:r>
+          </w:p>
+        </w:tc>
+      </w:tr>
+    </w:tbl>
+    <w:p/>
+    <w:tbl>
+      <w:tblPr>
+        <w:tblStyle w:val="LightGrid-Accent1"/>
+        <w:tblW w:type="auto" w:w="0"/>
+        <w:jc w:val="center"/>
+        <w:tblLook w:firstColumn="1" w:firstRow="1" w:lastColumn="0" w:lastRow="0" w:noHBand="0" w:noVBand="1" w:val="04A0"/>
+      </w:tblPr>
+      <w:tblGrid>
+        <w:gridCol w:w="3135"/>
+        <w:gridCol w:w="3135"/>
+        <w:gridCol w:w="3135"/>
+      </w:tblGrid>
+      <w:tr>
+        <w:tc>
+          <w:tcPr>
+            <w:tcW w:type="dxa" w:w="4535"/>
+          </w:tcPr>
+          <w:p>
+            <w:r/>
+            <w:r>
+              <w:rPr>
+                <w:b/>
+                <w:sz w:val="18"/>
+              </w:rPr>
+              <w:t>Cenário</w:t>
+            </w:r>
+          </w:p>
+        </w:tc>
+        <w:tc>
+          <w:tcPr>
+            <w:tcW w:type="dxa" w:w="1701"/>
+          </w:tcPr>
+          <w:p>
+            <w:r/>
+            <w:r>
+              <w:rPr>
+                <w:b/>
+                <w:sz w:val="18"/>
+              </w:rPr>
+              <w:t>Corrente total</w:t>
+            </w:r>
+          </w:p>
+        </w:tc>
+        <w:tc>
+          <w:tcPr>
+            <w:tcW w:type="dxa" w:w="2268"/>
+          </w:tcPr>
+          <w:p>
+            <w:r/>
+            <w:r>
+              <w:rPr>
+                <w:b/>
+                <w:sz w:val="18"/>
+              </w:rPr>
+              <w:t>% de uma fonte de 3 A</w:t>
+            </w:r>
+          </w:p>
+        </w:tc>
+      </w:tr>
+      <w:tr>
+        <w:tc>
+          <w:tcPr>
+            <w:tcW w:type="dxa" w:w="4535"/>
+          </w:tcPr>
+          <w:p>
+            <w:r/>
+            <w:r>
+              <w:rPr>
+                <w:sz w:val="18"/>
+              </w:rPr>
+              <w:t>Repouso — 4 servos parados sustentando o braço</w:t>
+            </w:r>
+          </w:p>
+        </w:tc>
+        <w:tc>
+          <w:tcPr>
+            <w:tcW w:type="dxa" w:w="1701"/>
+          </w:tcPr>
+          <w:p>
+            <w:r/>
+            <w:r>
+              <w:rPr>
+                <w:sz w:val="18"/>
+              </w:rPr>
+              <w:t>0,47 A</w:t>
+            </w:r>
+          </w:p>
+        </w:tc>
+        <w:tc>
+          <w:tcPr>
+            <w:tcW w:type="dxa" w:w="2268"/>
+          </w:tcPr>
+          <w:p>
+            <w:r/>
+            <w:r>
+              <w:rPr>
+                <w:sz w:val="18"/>
+              </w:rPr>
+              <w:t>16 %</w:t>
+            </w:r>
+          </w:p>
+        </w:tc>
+      </w:tr>
+      <w:tr>
+        <w:tc>
+          <w:tcPr>
+            <w:tcW w:type="dxa" w:w="4535"/>
+          </w:tcPr>
+          <w:p>
+            <w:r/>
+            <w:r>
+              <w:rPr>
+                <w:sz w:val="18"/>
+              </w:rPr>
+              <w:t>Manual (joystick) — 1 eixo movendo, 3 sustentando</w:t>
+            </w:r>
+          </w:p>
+        </w:tc>
+        <w:tc>
+          <w:tcPr>
+            <w:tcW w:type="dxa" w:w="1701"/>
+          </w:tcPr>
+          <w:p>
+            <w:r/>
+            <w:r>
+              <w:rPr>
+                <w:sz w:val="18"/>
+              </w:rPr>
+              <w:t>0,72 A</w:t>
+            </w:r>
+          </w:p>
+        </w:tc>
+        <w:tc>
+          <w:tcPr>
+            <w:tcW w:type="dxa" w:w="2268"/>
+          </w:tcPr>
+          <w:p>
+            <w:r/>
+            <w:r>
+              <w:rPr>
+                <w:sz w:val="18"/>
+              </w:rPr>
+              <w:t>24 %</w:t>
+            </w:r>
+          </w:p>
+        </w:tc>
+      </w:tr>
+      <w:tr>
+        <w:tc>
+          <w:tcPr>
+            <w:tcW w:type="dxa" w:w="4535"/>
+          </w:tcPr>
+          <w:p>
+            <w:r/>
+            <w:r>
+              <w:rPr>
+                <w:sz w:val="18"/>
+              </w:rPr>
+              <w:t>Manual com objeto de 25 g, garra apertando</w:t>
+            </w:r>
+          </w:p>
+        </w:tc>
+        <w:tc>
+          <w:tcPr>
+            <w:tcW w:type="dxa" w:w="1701"/>
+          </w:tcPr>
+          <w:p>
+            <w:r/>
+            <w:r>
+              <w:rPr>
+                <w:sz w:val="18"/>
+              </w:rPr>
+              <w:t>1,21 A</w:t>
+            </w:r>
+          </w:p>
+        </w:tc>
+        <w:tc>
+          <w:tcPr>
+            <w:tcW w:type="dxa" w:w="2268"/>
+          </w:tcPr>
+          <w:p>
+            <w:r/>
+            <w:r>
+              <w:rPr>
+                <w:sz w:val="18"/>
+              </w:rPr>
+              <w:t>40 %</w:t>
+            </w:r>
+          </w:p>
+        </w:tc>
+      </w:tr>
+      <w:tr>
+        <w:tc>
+          <w:tcPr>
+            <w:tcW w:type="dxa" w:w="4535"/>
+          </w:tcPr>
+          <w:p>
+            <w:r/>
+            <w:r>
+              <w:rPr>
+                <w:sz w:val="18"/>
+              </w:rPr>
+              <w:t>Reprodução — 4 eixos simultâneos, sem carga</w:t>
+            </w:r>
+          </w:p>
+        </w:tc>
+        <w:tc>
+          <w:tcPr>
+            <w:tcW w:type="dxa" w:w="1701"/>
+          </w:tcPr>
+          <w:p>
+            <w:r/>
+            <w:r>
+              <w:rPr>
+                <w:sz w:val="18"/>
+              </w:rPr>
+              <w:t>1,28 A</w:t>
+            </w:r>
+          </w:p>
+        </w:tc>
+        <w:tc>
+          <w:tcPr>
+            <w:tcW w:type="dxa" w:w="2268"/>
+          </w:tcPr>
+          <w:p>
+            <w:r/>
+            <w:r>
+              <w:rPr>
+                <w:sz w:val="18"/>
+              </w:rPr>
+              <w:t>43 %</w:t>
+            </w:r>
+          </w:p>
+        </w:tc>
+      </w:tr>
+      <w:tr>
+        <w:tc>
+          <w:tcPr>
+            <w:tcW w:type="dxa" w:w="4535"/>
+          </w:tcPr>
+          <w:p>
+            <w:r/>
+            <w:r>
+              <w:rPr>
+                <w:sz w:val="18"/>
+              </w:rPr>
+              <w:t>Reprodução — 4 eixos simultâneos + 25 g</w:t>
+            </w:r>
+          </w:p>
+        </w:tc>
+        <w:tc>
+          <w:tcPr>
+            <w:tcW w:type="dxa" w:w="1701"/>
+          </w:tcPr>
+          <w:p>
+            <w:r/>
+            <w:r>
+              <w:rPr>
+                <w:sz w:val="18"/>
+              </w:rPr>
+              <w:t>1,68 A</w:t>
+            </w:r>
+          </w:p>
+        </w:tc>
+        <w:tc>
+          <w:tcPr>
+            <w:tcW w:type="dxa" w:w="2268"/>
+          </w:tcPr>
+          <w:p>
+            <w:r/>
+            <w:r>
+              <w:rPr>
+                <w:sz w:val="18"/>
+              </w:rPr>
+              <w:t>56 %</w:t>
+            </w:r>
+          </w:p>
+        </w:tc>
+      </w:tr>
+      <w:tr>
+        <w:tc>
+          <w:tcPr>
+            <w:tcW w:type="dxa" w:w="4535"/>
+          </w:tcPr>
+          <w:p>
+            <w:r/>
+            <w:r>
+              <w:rPr>
+                <w:sz w:val="18"/>
+              </w:rPr>
+              <w:t>Reprodução — 4 eixos simultâneos + 50 g (carga útil máx.)</w:t>
+            </w:r>
+          </w:p>
+        </w:tc>
+        <w:tc>
+          <w:tcPr>
+            <w:tcW w:type="dxa" w:w="1701"/>
+          </w:tcPr>
+          <w:p>
+            <w:r/>
+            <w:r>
+              <w:rPr>
+                <w:sz w:val="18"/>
+              </w:rPr>
+              <w:t>1,85 A</w:t>
+            </w:r>
+          </w:p>
+        </w:tc>
+        <w:tc>
+          <w:tcPr>
+            <w:tcW w:type="dxa" w:w="2268"/>
+          </w:tcPr>
+          <w:p>
+            <w:r/>
+            <w:r>
+              <w:rPr>
+                <w:sz w:val="18"/>
+              </w:rPr>
+              <w:t>62 %</w:t>
+            </w:r>
+          </w:p>
+        </w:tc>
+      </w:tr>
+      <w:tr>
+        <w:tc>
+          <w:tcPr>
+            <w:tcW w:type="dxa" w:w="4535"/>
+          </w:tcPr>
+          <w:p>
+            <w:r/>
+            <w:r>
+              <w:rPr>
+                <w:sz w:val="18"/>
+              </w:rPr>
+              <w:t>Falha — os 4 servos travados ao mesmo tempo</w:t>
+            </w:r>
+          </w:p>
+        </w:tc>
+        <w:tc>
+          <w:tcPr>
+            <w:tcW w:type="dxa" w:w="1701"/>
+          </w:tcPr>
+          <w:p>
+            <w:r/>
+            <w:r>
+              <w:rPr>
+                <w:sz w:val="18"/>
+              </w:rPr>
+              <w:t>2,70 A</w:t>
+            </w:r>
+          </w:p>
+        </w:tc>
+        <w:tc>
+          <w:tcPr>
+            <w:tcW w:type="dxa" w:w="2268"/>
+          </w:tcPr>
+          <w:p>
+            <w:r/>
+            <w:r>
+              <w:rPr>
+                <w:sz w:val="18"/>
+              </w:rPr>
+              <w:t>90 %</w:t>
+            </w:r>
+          </w:p>
+        </w:tc>
+      </w:tr>
+      <w:tr>
+        <w:tc>
+          <w:tcPr>
+            <w:tcW w:type="dxa" w:w="4535"/>
+          </w:tcPr>
+          <w:p>
+            <w:r/>
+            <w:r>
+              <w:rPr>
+                <w:sz w:val="18"/>
+              </w:rPr>
+              <w:t>Pico de milissegundos — 1 servo invertendo o sentido</w:t>
+            </w:r>
+          </w:p>
+        </w:tc>
+        <w:tc>
+          <w:tcPr>
+            <w:tcW w:type="dxa" w:w="1701"/>
+          </w:tcPr>
+          <w:p>
+            <w:r/>
+            <w:r>
+              <w:rPr>
+                <w:sz w:val="18"/>
+              </w:rPr>
+              <w:t>≈ 2,6 A</w:t>
+            </w:r>
+          </w:p>
+        </w:tc>
+        <w:tc>
+          <w:tcPr>
+            <w:tcW w:type="dxa" w:w="2268"/>
+          </w:tcPr>
+          <w:p>
+            <w:r/>
+            <w:r>
+              <w:rPr>
+                <w:sz w:val="18"/>
+              </w:rPr>
+              <w:t>—</w:t>
+            </w:r>
+          </w:p>
+        </w:tc>
+      </w:tr>
+    </w:tbl>
+    <w:p/>
+    <w:p>
+      <w:pPr>
+        <w:jc w:val="both"/>
+      </w:pPr>
+      <w:r>
+        <w:rPr>
+          <w:b w:val="0"/>
+          <w:i w:val="0"/>
+        </w:rPr>
+        <w:t>Em operação normal o pior caso é 1,85 A. O consumo só se aproxima de 3 A na condição de falha em que os quatro servos travam simultaneamente (braço preso, garra fechando sobre um objeto rígido além do limite) — situação em que uma fonte de 3 A trabalharia a 90 % do valor nominal, sem margem para a queda de tensão típica dessas placas sob carga plena. Por isso especificou-se 5 V / 5 A: mantém 85 % de margem mesmo nessa falha, sem custo relevante. Uma fonte de 3 A de boa procedência atende ao projeto; uma de 2 A, não.</w:t>
+      </w:r>
+    </w:p>
+    <w:p>
+      <w:pPr>
+        <w:jc w:val="both"/>
+      </w:pPr>
+      <w:r>
+        <w:rPr>
+          <w:b w:val="0"/>
+          <w:i w:val="0"/>
+        </w:rPr>
+        <w:t>Capacitor e capacidade de corrente resolvem problemas diferentes. Quando um servo inverte o sentido em plena velocidade, a força contra-eletromotriz soma-se à tensão aplicada e a corrente chega a cerca de 1,4 A por alguns milissegundos; nenhuma fonte chaveada responde em microssegundos, e é o capacitor que entrega esse degrau localmente. Mas a energia armazenada é pequena: C1 = 1000 µF, admitindo 0,2 V de queda, guarda 0,2 mC — suficiente para sustentar um déficit de 2 A por apenas 100 µs. Para cobrir um travamento de 1 s seriam necessários cerca de 2 F (2 000 000 µF). O capacitor elimina, portanto, a queda rápida de tensão (que provoca reset do Arduino, quando alimentado pela mesma fonte, e tremor nos servos), mas não substitui a capacidade de corrente da fonte, e o inverso também é verdadeiro: uma fonte de 10 A sem capacitor continuaria a afundar no transitório por causa da indutância dos cabos.</w:t>
+      </w:r>
+    </w:p>
+    <w:p>
+      <w:pPr>
+        <w:jc w:val="both"/>
+      </w:pPr>
+      <w:r>
+        <w:rPr>
+          <w:b w:val="0"/>
+          <w:i w:val="0"/>
+        </w:rPr>
+        <w:t>Requisitos da fonte: 5 V ± 5 % chaveada, ≥ 4 A (5 A recomendado), regulação de carga melhor que 5 %, ondulação &lt; 100 mV pico a pico e proteção contra sobrecorrente. Não elevar para 6 V em busca dos 2,2 kgf·cm: a corrente de travamento subiria para ≈ 0,85 A por servo (3,4 A no conjunto) e toda a análise de torque da seção 5.4 foi feita para 1,8 kgf·cm a 5 V.</w:t>
+      </w:r>
+    </w:p>
+    <w:p>
+      <w:pPr>
+        <w:jc w:val="both"/>
+      </w:pPr>
+      <w:r>
+        <w:rPr>
+          <w:b w:val="0"/>
+          <w:i w:val="0"/>
+        </w:rPr>
+        <w:t>Fiação: o orçamento de queda de tensão é de apenas 200 mV (5,0 V da fonte contra os 4,8 V mínimos do datasheet). Meio metro de jumper 22 AWG conduzindo 2 A já consome 106 mV (ida e volta); recomenda-se 20 AWG ou mais grosso no trecho fonte → protoboard. O elo mais frágil é o contato da protoboard: cada ponto suporta cerca de 1 A, de modo que a entrada da fonte deve ser feita por dois furos em paralelo (ou por um borne parafusado) e os quatro servos devem ser distribuídos ao longo da trilha, nunca no mesmo furo.</w:t>
+      </w:r>
+    </w:p>
+    <w:p>
+      <w:pPr>
+        <w:pStyle w:val="Heading1"/>
+      </w:pPr>
+      <w:r>
+        <w:t>9. Firmware (Arduino IDE)</w:t>
+      </w:r>
+    </w:p>
+    <w:p>
+      <w:pPr>
+        <w:jc w:val="both"/>
+      </w:pPr>
+      <w:r>
+        <w:rPr>
+          <w:b w:val="0"/>
+          <w:i w:val="0"/>
+        </w:rPr>
         <w:t>Arquivo: firmware/braco_robotico/braco_robotico.ino. Bibliotecas: Servo.h e EEPROM.h (nativas da IDE). Placa: Arduino UNO.</w:t>
       </w:r>
     </w:p>
@@ -6804,7 +7606,15 @@
         <w:pStyle w:val="ListNumber"/>
       </w:pPr>
       <w:r>
-        <w:t>Medir a corrente da fonte durante o movimento; se o Arduino reiniciar, verificar o GND comum e o capacitor C1.</w:t>
+        <w:t>Medir a corrente da fonte durante o movimento (multímetro em série na linha +5 V dos servos): esperam-se ≈ 0,5 A em repouso e 1,2–1,9 A com os quatro eixos em movimento sob carga (seção 8.1). Leitura muito acima disso indica servo travado contra um batente; se o Arduino reiniciar, verificar o GND comum e o capacitor C1.</w:t>
+      </w:r>
+    </w:p>
+    <w:p>
+      <w:pPr>
+        <w:pStyle w:val="ListNumber"/>
+      </w:pPr>
+      <w:r>
+        <w:t>Medir a tensão no barramento dos servos com o braço em esforço: não deve cair abaixo de 4,8 V. Se cair, a fonte está subdimensionada ou os fios de alimentação são finos demais.</w:t>
       </w:r>
     </w:p>
     <w:p>

</xml_diff>